<commit_message>
Correct GPA font and nested presentation indentation with aligned dates
</commit_message>
<xml_diff>
--- a/resumes/Samya_Samanta_AstraZeneca_Elegant.docx
+++ b/resumes/Samya_Samanta_AstraZeneca_Elegant.docx
@@ -416,7 +416,7 @@
       </w:pPr>
       <w:r>
         <w:rPr>
-          <w:rFonts w:eastAsia="Arial" w:cs="Arial" w:ascii="Arial" w:hAnsi="Arial"/>
+          <w:rFonts w:eastAsia="Palatino" w:cs="Palatino" w:ascii="Palatino" w:hAnsi="Palatino"/>
           <w:sz w:val="20"/>
           <w:szCs w:val="20"/>
           <w:color w:val="292D32"/>
@@ -3005,17 +3005,23 @@
         <w:keepNext w:val="0"/>
         <w:keepLines/>
         <w:pageBreakBefore w:val="0"/>
-        <w:numPr>
-          <w:ilvl w:val="0"/>
-          <w:numId w:val="14"/>
-        </w:numPr>
         <w:tabs>
           <w:tab w:pos="460" w:val="left"/>
+          <w:tab w:pos="10858" w:val="right"/>
         </w:tabs>
         <w:spacing w:after="30" w:line="230" w:lineRule="exact" w:before="0"/>
-        <w:ind w:left="460" w:hanging="200"/>
+        <w:ind w:left="460" w:hanging="300" w:right="0"/>
         <w:jc w:val="both"/>
       </w:pPr>
+      <w:r>
+        <w:rPr>
+          <w:rFonts w:ascii="Palatino" w:hAnsi="Palatino"/>
+          <w:b w:val="0"/>
+          <w:sz w:val="20"/>
+        </w:rPr>
+        <w:t>1.</w:t>
+        <w:tab/>
+      </w:r>
       <w:r>
         <w:rPr>
           <w:rFonts w:eastAsia="Palatino" w:cs="Palatino" w:ascii="Palatino" w:hAnsi="Palatino"/>
@@ -3101,150 +3107,228 @@
     </w:p>
     <w:p>
       <w:pPr>
+        <w:keepNext/>
+        <w:keepLines/>
+        <w:pageBreakBefore w:val="0"/>
+        <w:tabs>
+          <w:tab w:pos="460" w:val="left"/>
+          <w:tab w:pos="10858" w:val="right"/>
+        </w:tabs>
+        <w:spacing w:after="30" w:line="230" w:lineRule="exact" w:before="0"/>
+        <w:ind w:left="460" w:hanging="300" w:right="0"/>
+        <w:jc w:val="both"/>
+      </w:pPr>
+      <w:r>
+        <w:rPr>
+          <w:rFonts w:ascii="Palatino" w:hAnsi="Palatino"/>
+          <w:b w:val="0"/>
+          <w:sz w:val="20"/>
+        </w:rPr>
+        <w:t>2.</w:t>
+        <w:tab/>
+      </w:r>
+      <w:r>
+        <w:rPr>
+          <w:rFonts w:eastAsia="Palatino" w:cs="Palatino" w:ascii="Palatino" w:hAnsi="Palatino"/>
+          <w:bCs/>
+          <w:sz w:val="20"/>
+          <w:szCs w:val="20"/>
+          <w:color w:val="292D32"/>
+        </w:rPr>
+        <w:t xml:space="preserve">Samanta, S.</w:t>
+      </w:r>
+      <w:r>
+        <w:rPr>
+          <w:rFonts w:eastAsia="Palatino" w:cs="Palatino" w:ascii="Palatino" w:hAnsi="Palatino"/>
+          <w:sz w:val="20"/>
+          <w:szCs w:val="20"/>
+          <w:color w:val="292D32"/>
+        </w:rPr>
+        <w:t xml:space="preserve">; Powers, D. C. “</w:t>
+      </w:r>
+      <w:r>
+        <w:rPr>
+          <w:rFonts w:ascii="Aptos" w:hAnsi="Aptos" w:cs="Times New Roman"/>
+          <w:i/>
+          <w:iCs/>
+          <w:sz w:val="20"/>
+          <w:szCs w:val="20"/>
+          <w:color w:val="292D32"/>
+        </w:rPr>
+        <w:sym w:font="Symbol" w:char="F062"/>
+      </w:r>
+      <w:r>
+        <w:rPr>
+          <w:rFonts w:eastAsia="Palatino" w:cs="Palatino" w:ascii="Palatino" w:hAnsi="Palatino"/>
+          <w:i/>
+          <w:iCs/>
+          <w:sz w:val="20"/>
+          <w:szCs w:val="20"/>
+          <w:color w:val="292D32"/>
+        </w:rPr>
+        <w:t xml:space="preserve">-Phenethylamine Synthesis: </w:t>
+      </w:r>
+      <w:r>
+        <w:rPr>
+          <w:rFonts w:eastAsia="Palatino" w:cs="Palatino" w:ascii="Palatino" w:hAnsi="Palatino"/>
+          <w:i w:val="1"/>
+          <w:iCs/>
+          <w:sz w:val="20"/>
+          <w:szCs w:val="20"/>
+          <w:color w:val="292D32"/>
+        </w:rPr>
+        <w:t xml:space="preserve">N</w:t>
+      </w:r>
+      <w:r>
+        <w:rPr>
+          <w:rFonts w:eastAsia="Palatino" w:cs="Palatino" w:ascii="Palatino" w:hAnsi="Palatino"/>
+          <w:i/>
+          <w:iCs/>
+          <w:sz w:val="20"/>
+          <w:szCs w:val="20"/>
+          <w:color w:val="292D32"/>
+        </w:rPr>
+        <w:t xml:space="preserve">-Pyridinium Aziridines</w:t>
+      </w:r>
+      <w:r>
+        <w:rPr>
+          <w:rFonts w:eastAsia="Palatino" w:cs="Palatino" w:ascii="Palatino" w:hAnsi="Palatino"/>
+          <w:bCs/>
+          <w:i/>
+          <w:iCs/>
+          <w:sz w:val="20"/>
+          <w:szCs w:val="20"/>
+          <w:color w:val="292D32"/>
+        </w:rPr>
+        <w:t xml:space="preserve"> </w:t>
+      </w:r>
+      <w:r>
+        <w:rPr>
+          <w:rFonts w:eastAsia="Palatino" w:cs="Palatino" w:ascii="Palatino" w:hAnsi="Palatino"/>
+          <w:i/>
+          <w:iCs/>
+          <w:sz w:val="20"/>
+          <w:szCs w:val="20"/>
+          <w:color w:val="292D32"/>
+        </w:rPr>
+        <w:t xml:space="preserve">as Latent Dual Electrophiles.</w:t>
+      </w:r>
+      <w:r>
+        <w:rPr>
+          <w:rFonts w:eastAsia="Palatino" w:cs="Palatino" w:ascii="Palatino" w:hAnsi="Palatino"/>
+          <w:sz w:val="20"/>
+          <w:szCs w:val="20"/>
+          <w:color w:val="292D32"/>
+        </w:rPr>
+        <w:t xml:space="preserve">” </w:t>
+      </w:r>
+    </w:p>
+    <w:p>
+      <w:pPr>
+        <w:keepNext/>
+        <w:keepLines/>
+        <w:pageBreakBefore w:val="0"/>
+        <w:tabs>
+          <w:tab w:pos="720" w:val="left"/>
+          <w:tab w:pos="10858" w:val="right"/>
+        </w:tabs>
+        <w:spacing w:after="30" w:line="230" w:lineRule="exact" w:before="0"/>
+        <w:ind w:left="720" w:hanging="260" w:right="0"/>
+        <w:jc w:val="both"/>
+      </w:pPr>
+      <w:r>
+        <w:rPr>
+          <w:rFonts w:ascii="Palatino" w:hAnsi="Palatino"/>
+          <w:b w:val="0"/>
+          <w:sz w:val="20"/>
+        </w:rPr>
+        <w:t>a)</w:t>
+        <w:tab/>
+      </w:r>
+      <w:r>
+        <w:rPr>
+          <w:rFonts w:eastAsia="Palatino" w:cs="Palatino" w:ascii="Palatino" w:hAnsi="Palatino"/>
+          <w:bCs/>
+          <w:sz w:val="20"/>
+          <w:szCs w:val="20"/>
+          <w:color w:val="292D32"/>
+        </w:rPr>
+        <w:t xml:space="preserve">Welch Conference </w:t>
+      </w:r>
+      <w:r>
+        <w:rPr>
+          <w:rFonts w:eastAsia="Palatino" w:cs="Palatino" w:ascii="Palatino" w:hAnsi="Palatino"/>
+          <w:sz w:val="20"/>
+          <w:szCs w:val="20"/>
+          <w:color w:val="292D32"/>
+        </w:rPr>
+        <w:t xml:space="preserve">on ‘Frontiers in Molecular Catalysis’</w:t>
+      </w:r>
+      <w:r>
+        <w:rPr>
+          <w:rFonts w:eastAsia="Palatino" w:cs="Palatino" w:ascii="Palatino" w:hAnsi="Palatino"/>
+          <w:color w:val="606A74"/>
+          <w:sz w:val="20"/>
+          <w:szCs w:val="20"/>
+          <w:b w:val="0"/>
+          <w:i w:val="0"/>
+        </w:rPr>
+        <w:tab/>
+      </w:r>
+      <w:r>
+        <w:rPr>
+          <w:rFonts w:eastAsia="Palatino" w:cs="Palatino" w:ascii="Palatino" w:hAnsi="Palatino"/>
+          <w:b w:val="0"/>
+          <w:bCs/>
+          <w:i w:val="0"/>
+          <w:iCs/>
+          <w:color w:val="606A74"/>
+          <w:sz w:val="20"/>
+          <w:szCs w:val="20"/>
+        </w:rPr>
+        <w:t xml:space="preserve">Oct 2024</w:t>
+      </w:r>
+    </w:p>
+    <w:p>
+      <w:pPr>
         <w:keepNext w:val="0"/>
         <w:keepLines/>
         <w:pageBreakBefore w:val="0"/>
-        <w:numPr>
-          <w:ilvl w:val="0"/>
-          <w:numId w:val="14"/>
-        </w:numPr>
         <w:tabs>
-          <w:tab w:pos="460" w:val="left"/>
+          <w:tab w:pos="720" w:val="left"/>
+          <w:tab w:pos="10858" w:val="right"/>
         </w:tabs>
         <w:spacing w:after="30" w:line="230" w:lineRule="exact" w:before="0"/>
-        <w:ind w:left="460" w:hanging="200"/>
+        <w:ind w:left="720" w:hanging="260" w:right="0"/>
         <w:jc w:val="both"/>
       </w:pPr>
       <w:r>
         <w:rPr>
-          <w:rFonts w:eastAsia="Palatino" w:cs="Palatino" w:ascii="Palatino" w:hAnsi="Palatino"/>
-          <w:bCs/>
-          <w:sz w:val="20"/>
-          <w:szCs w:val="20"/>
-          <w:color w:val="292D32"/>
-        </w:rPr>
-        <w:t xml:space="preserve">Samanta, S.</w:t>
-      </w:r>
-      <w:r>
-        <w:rPr>
-          <w:rFonts w:eastAsia="Palatino" w:cs="Palatino" w:ascii="Palatino" w:hAnsi="Palatino"/>
-          <w:sz w:val="20"/>
-          <w:szCs w:val="20"/>
-          <w:color w:val="292D32"/>
-        </w:rPr>
-        <w:t xml:space="preserve">; Powers, D. C. “</w:t>
-      </w:r>
-      <w:r>
-        <w:rPr>
-          <w:rFonts w:ascii="Aptos" w:hAnsi="Aptos" w:cs="Times New Roman"/>
-          <w:i/>
-          <w:iCs/>
-          <w:sz w:val="20"/>
-          <w:szCs w:val="20"/>
-          <w:color w:val="292D32"/>
-        </w:rPr>
-        <w:sym w:font="Symbol" w:char="F062"/>
-      </w:r>
-      <w:r>
-        <w:rPr>
-          <w:rFonts w:eastAsia="Palatino" w:cs="Palatino" w:ascii="Palatino" w:hAnsi="Palatino"/>
-          <w:i/>
-          <w:iCs/>
-          <w:sz w:val="20"/>
-          <w:szCs w:val="20"/>
-          <w:color w:val="292D32"/>
-        </w:rPr>
-        <w:t xml:space="preserve">-Phenethylamine Synthesis: </w:t>
-      </w:r>
-      <w:r>
-        <w:rPr>
-          <w:rFonts w:eastAsia="Palatino" w:cs="Palatino" w:ascii="Palatino" w:hAnsi="Palatino"/>
-          <w:i w:val="1"/>
-          <w:iCs/>
-          <w:sz w:val="20"/>
-          <w:szCs w:val="20"/>
-          <w:color w:val="292D32"/>
-        </w:rPr>
-        <w:t xml:space="preserve">N</w:t>
-      </w:r>
-      <w:r>
-        <w:rPr>
-          <w:rFonts w:eastAsia="Palatino" w:cs="Palatino" w:ascii="Palatino" w:hAnsi="Palatino"/>
-          <w:i/>
-          <w:iCs/>
-          <w:sz w:val="20"/>
-          <w:szCs w:val="20"/>
-          <w:color w:val="292D32"/>
-        </w:rPr>
-        <w:t xml:space="preserve">-Pyridinium Aziridines</w:t>
-      </w:r>
-      <w:r>
-        <w:rPr>
-          <w:rFonts w:eastAsia="Palatino" w:cs="Palatino" w:ascii="Palatino" w:hAnsi="Palatino"/>
-          <w:bCs/>
-          <w:i/>
-          <w:iCs/>
-          <w:sz w:val="20"/>
-          <w:szCs w:val="20"/>
-          <w:color w:val="292D32"/>
-        </w:rPr>
-        <w:t xml:space="preserve"> </w:t>
-      </w:r>
-      <w:r>
-        <w:rPr>
-          <w:rFonts w:eastAsia="Palatino" w:cs="Palatino" w:ascii="Palatino" w:hAnsi="Palatino"/>
-          <w:i/>
-          <w:iCs/>
-          <w:sz w:val="20"/>
-          <w:szCs w:val="20"/>
-          <w:color w:val="292D32"/>
-        </w:rPr>
-        <w:t xml:space="preserve">as Latent Dual Electrophiles.</w:t>
-      </w:r>
-      <w:r>
-        <w:rPr>
-          <w:rFonts w:eastAsia="Palatino" w:cs="Palatino" w:ascii="Palatino" w:hAnsi="Palatino"/>
-          <w:sz w:val="20"/>
-          <w:szCs w:val="20"/>
-          <w:color w:val="292D32"/>
-        </w:rPr>
-        <w:t xml:space="preserve">” </w:t>
-      </w:r>
-    </w:p>
-    <w:p>
-      <w:pPr>
-        <w:keepNext w:val="0"/>
-        <w:keepLines/>
-        <w:pageBreakBefore w:val="0"/>
-        <w:numPr>
-          <w:ilvl w:val="0"/>
-          <w:numId w:val="18"/>
-        </w:numPr>
-        <w:tabs>
-          <w:tab w:pos="460" w:val="left"/>
-        </w:tabs>
-        <w:spacing w:after="30" w:line="230" w:lineRule="exact" w:before="0"/>
-        <w:ind w:left="360" w:hanging="200"/>
-        <w:jc w:val="both"/>
-      </w:pPr>
-      <w:r>
-        <w:rPr>
-          <w:rFonts w:eastAsia="Palatino" w:cs="Palatino" w:ascii="Palatino" w:hAnsi="Palatino"/>
-          <w:bCs/>
-          <w:sz w:val="20"/>
-          <w:szCs w:val="20"/>
-          <w:color w:val="292D32"/>
-        </w:rPr>
-        <w:t xml:space="preserve">Welch Conference </w:t>
-      </w:r>
-      <w:r>
-        <w:rPr>
-          <w:rFonts w:eastAsia="Palatino" w:cs="Palatino" w:ascii="Palatino" w:hAnsi="Palatino"/>
-          <w:sz w:val="20"/>
-          <w:szCs w:val="20"/>
-          <w:color w:val="292D32"/>
-        </w:rPr>
-        <w:t xml:space="preserve">on ‘Frontiers in Molecular Catalysis’</w:t>
+          <w:rFonts w:ascii="Palatino" w:hAnsi="Palatino"/>
+          <w:b w:val="0"/>
+          <w:sz w:val="20"/>
+        </w:rPr>
+        <w:t>b)</w:t>
+        <w:tab/>
+      </w:r>
+      <w:r>
+        <w:rPr>
+          <w:rFonts w:eastAsia="Palatino" w:cs="Palatino" w:ascii="Palatino" w:hAnsi="Palatino"/>
+          <w:bCs/>
+          <w:sz w:val="20"/>
+          <w:szCs w:val="20"/>
+          <w:color w:val="292D32"/>
+        </w:rPr>
+        <w:t xml:space="preserve">Graduate Research Symposium </w:t>
+      </w:r>
+      <w:r>
+        <w:rPr>
+          <w:rFonts w:eastAsia="Palatino" w:cs="Palatino" w:ascii="Palatino" w:hAnsi="Palatino"/>
+          <w:sz w:val="20"/>
+          <w:szCs w:val="20"/>
+          <w:color w:val="292D32"/>
+        </w:rPr>
+        <w:t xml:space="preserve">by ACS Division of Organic Chemistry at Virginia</w:t>
       </w:r>
       <w:r>
         <w:rPr>
@@ -3268,172 +3352,124 @@
           <w:sz w:val="20"/>
           <w:szCs w:val="20"/>
         </w:rPr>
-        <w:t xml:space="preserve">Oct 2024</w:t>
+        <w:t xml:space="preserve">July 2024</w:t>
       </w:r>
     </w:p>
     <w:p>
       <w:pPr>
-        <w:keepNext w:val="0"/>
+        <w:keepNext/>
         <w:keepLines/>
         <w:pageBreakBefore w:val="0"/>
-        <w:numPr>
-          <w:ilvl w:val="0"/>
-          <w:numId w:val="18"/>
-        </w:numPr>
         <w:tabs>
           <w:tab w:pos="460" w:val="left"/>
+          <w:tab w:pos="10858" w:val="right"/>
         </w:tabs>
         <w:spacing w:after="30" w:line="230" w:lineRule="exact" w:before="0"/>
-        <w:ind w:left="360" w:hanging="200"/>
+        <w:ind w:left="460" w:hanging="300" w:right="0"/>
         <w:jc w:val="both"/>
       </w:pPr>
       <w:r>
         <w:rPr>
-          <w:rFonts w:eastAsia="Palatino" w:cs="Palatino" w:ascii="Palatino" w:hAnsi="Palatino"/>
-          <w:bCs/>
-          <w:sz w:val="20"/>
-          <w:szCs w:val="20"/>
-          <w:color w:val="292D32"/>
-        </w:rPr>
-        <w:t xml:space="preserve">Graduate Research Symposium </w:t>
-      </w:r>
-      <w:r>
-        <w:rPr>
-          <w:rFonts w:eastAsia="Palatino" w:cs="Palatino" w:ascii="Palatino" w:hAnsi="Palatino"/>
-          <w:sz w:val="20"/>
-          <w:szCs w:val="20"/>
-          <w:color w:val="292D32"/>
-        </w:rPr>
-        <w:t xml:space="preserve">by ACS Division of Organic Chemistry at Virginia</w:t>
-      </w:r>
-      <w:r>
-        <w:rPr>
-          <w:rFonts w:eastAsia="Palatino" w:cs="Palatino" w:ascii="Palatino" w:hAnsi="Palatino"/>
-          <w:color w:val="606A74"/>
-          <w:sz w:val="20"/>
-          <w:szCs w:val="20"/>
+          <w:rFonts w:ascii="Palatino" w:hAnsi="Palatino"/>
           <w:b w:val="0"/>
-          <w:i w:val="0"/>
-        </w:rPr>
+          <w:sz w:val="20"/>
+        </w:rPr>
+        <w:t>3.</w:t>
         <w:tab/>
       </w:r>
       <w:r>
         <w:rPr>
           <w:rFonts w:eastAsia="Palatino" w:cs="Palatino" w:ascii="Palatino" w:hAnsi="Palatino"/>
-          <w:b w:val="0"/>
-          <w:bCs/>
-          <w:i w:val="0"/>
+          <w:bCs/>
+          <w:sz w:val="20"/>
+          <w:szCs w:val="20"/>
+          <w:color w:val="292D32"/>
+        </w:rPr>
+        <w:t xml:space="preserve">Samanta, S.</w:t>
+      </w:r>
+      <w:r>
+        <w:rPr>
+          <w:rFonts w:eastAsia="Palatino" w:cs="Palatino" w:ascii="Palatino" w:hAnsi="Palatino"/>
+          <w:sz w:val="20"/>
+          <w:szCs w:val="20"/>
+          <w:color w:val="292D32"/>
+        </w:rPr>
+        <w:t xml:space="preserve">; Powers, D. C. “</w:t>
+      </w:r>
+      <w:r>
+        <w:rPr>
+          <w:rFonts w:eastAsia="Palatino" w:cs="Palatino" w:ascii="Palatino" w:hAnsi="Palatino"/>
+          <w:i/>
           <w:iCs/>
-          <w:color w:val="606A74"/>
-          <w:sz w:val="20"/>
-          <w:szCs w:val="20"/>
-        </w:rPr>
-        <w:t xml:space="preserve">July 2024</w:t>
+          <w:sz w:val="20"/>
+          <w:szCs w:val="20"/>
+          <w:color w:val="292D32"/>
+        </w:rPr>
+        <w:t xml:space="preserve">Development of 1,2-Aminofunctionalized Library from </w:t>
+      </w:r>
+      <w:r>
+        <w:rPr>
+          <w:rFonts w:eastAsia="Palatino" w:cs="Palatino" w:ascii="Palatino" w:hAnsi="Palatino"/>
+          <w:i w:val="1"/>
+          <w:iCs/>
+          <w:sz w:val="20"/>
+          <w:szCs w:val="20"/>
+          <w:color w:val="292D32"/>
+        </w:rPr>
+        <w:t xml:space="preserve">N</w:t>
+      </w:r>
+      <w:r>
+        <w:rPr>
+          <w:rFonts w:eastAsia="Palatino" w:cs="Palatino" w:ascii="Palatino" w:hAnsi="Palatino"/>
+          <w:i/>
+          <w:iCs/>
+          <w:sz w:val="20"/>
+          <w:szCs w:val="20"/>
+          <w:color w:val="292D32"/>
+        </w:rPr>
+        <w:t xml:space="preserve">-Pyridinium Aziridines.</w:t>
+      </w:r>
+      <w:r>
+        <w:rPr>
+          <w:rFonts w:eastAsia="Palatino" w:cs="Palatino" w:ascii="Palatino" w:hAnsi="Palatino"/>
+          <w:sz w:val="20"/>
+          <w:szCs w:val="20"/>
+          <w:color w:val="292D32"/>
+        </w:rPr>
+        <w:t xml:space="preserve">”</w:t>
+      </w:r>
+      <w:r>
+        <w:rPr>
+          <w:rFonts w:eastAsia="Palatino" w:cs="Palatino" w:ascii="Palatino" w:hAnsi="Palatino"/>
+          <w:sz w:val="20"/>
+          <w:szCs w:val="20"/>
+          <w:color w:val="292D32"/>
+        </w:rPr>
+        <w:t xml:space="preserve"> </w:t>
       </w:r>
     </w:p>
     <w:p>
       <w:pPr>
-        <w:keepNext w:val="0"/>
+        <w:keepNext/>
         <w:keepLines/>
         <w:pageBreakBefore w:val="0"/>
-        <w:numPr>
-          <w:ilvl w:val="0"/>
-          <w:numId w:val="14"/>
-        </w:numPr>
         <w:tabs>
-          <w:tab w:pos="460" w:val="left"/>
+          <w:tab w:pos="720" w:val="left"/>
+          <w:tab w:pos="10858" w:val="right"/>
         </w:tabs>
         <w:spacing w:after="30" w:line="230" w:lineRule="exact" w:before="0"/>
-        <w:ind w:left="460" w:hanging="200"/>
+        <w:ind w:left="720" w:hanging="260" w:right="0"/>
         <w:jc w:val="both"/>
       </w:pPr>
       <w:r>
         <w:rPr>
-          <w:rFonts w:eastAsia="Palatino" w:cs="Palatino" w:ascii="Palatino" w:hAnsi="Palatino"/>
-          <w:bCs/>
-          <w:sz w:val="20"/>
-          <w:szCs w:val="20"/>
-          <w:color w:val="292D32"/>
-        </w:rPr>
-        <w:t xml:space="preserve">Samanta, S.</w:t>
-      </w:r>
-      <w:r>
-        <w:rPr>
-          <w:rFonts w:eastAsia="Palatino" w:cs="Palatino" w:ascii="Palatino" w:hAnsi="Palatino"/>
-          <w:sz w:val="20"/>
-          <w:szCs w:val="20"/>
-          <w:color w:val="292D32"/>
-        </w:rPr>
-        <w:t xml:space="preserve">; Powers, D. C. “</w:t>
-      </w:r>
-      <w:r>
-        <w:rPr>
-          <w:rFonts w:eastAsia="Palatino" w:cs="Palatino" w:ascii="Palatino" w:hAnsi="Palatino"/>
-          <w:i/>
-          <w:iCs/>
-          <w:sz w:val="20"/>
-          <w:szCs w:val="20"/>
-          <w:color w:val="292D32"/>
-        </w:rPr>
-        <w:t xml:space="preserve">Development of 1,2-Aminofunctionalized Library from </w:t>
-      </w:r>
-      <w:r>
-        <w:rPr>
-          <w:rFonts w:eastAsia="Palatino" w:cs="Palatino" w:ascii="Palatino" w:hAnsi="Palatino"/>
-          <w:i w:val="1"/>
-          <w:iCs/>
-          <w:sz w:val="20"/>
-          <w:szCs w:val="20"/>
-          <w:color w:val="292D32"/>
-        </w:rPr>
-        <w:t xml:space="preserve">N</w:t>
-      </w:r>
-      <w:r>
-        <w:rPr>
-          <w:rFonts w:eastAsia="Palatino" w:cs="Palatino" w:ascii="Palatino" w:hAnsi="Palatino"/>
-          <w:i/>
-          <w:iCs/>
-          <w:sz w:val="20"/>
-          <w:szCs w:val="20"/>
-          <w:color w:val="292D32"/>
-        </w:rPr>
-        <w:t xml:space="preserve">-Pyridinium Aziridines.</w:t>
-      </w:r>
-      <w:r>
-        <w:rPr>
-          <w:rFonts w:eastAsia="Palatino" w:cs="Palatino" w:ascii="Palatino" w:hAnsi="Palatino"/>
-          <w:sz w:val="20"/>
-          <w:szCs w:val="20"/>
-          <w:color w:val="292D32"/>
-        </w:rPr>
-        <w:t xml:space="preserve">”</w:t>
-      </w:r>
-      <w:r>
-        <w:rPr>
-          <w:rFonts w:eastAsia="Palatino" w:cs="Palatino" w:ascii="Palatino" w:hAnsi="Palatino"/>
-          <w:sz w:val="20"/>
-          <w:szCs w:val="20"/>
-          <w:color w:val="292D32"/>
-        </w:rPr>
-        <w:t xml:space="preserve"> </w:t>
-      </w:r>
-    </w:p>
-    <w:p>
-      <w:pPr>
-        <w:keepNext w:val="0"/>
-        <w:keepLines/>
-        <w:pageBreakBefore w:val="0"/>
-        <w:numPr>
-          <w:ilvl w:val="1"/>
-          <w:numId w:val="14"/>
-        </w:numPr>
-        <w:tabs>
-          <w:tab w:pos="460" w:val="left"/>
-        </w:tabs>
-        <w:spacing w:after="30" w:line="230" w:lineRule="exact" w:before="0"/>
-        <w:ind w:left="360" w:hanging="200"/>
-        <w:jc w:val="both"/>
-      </w:pPr>
+          <w:rFonts w:ascii="Palatino" w:hAnsi="Palatino"/>
+          <w:b w:val="0"/>
+          <w:sz w:val="20"/>
+        </w:rPr>
+        <w:t>a)</w:t>
+        <w:tab/>
+      </w:r>
       <w:r>
         <w:rPr>
           <w:rFonts w:eastAsia="Palatino" w:cs="Palatino" w:ascii="Palatino" w:hAnsi="Palatino"/>
@@ -3508,80 +3544,92 @@
     </w:p>
     <w:p>
       <w:pPr>
+        <w:keepNext/>
+        <w:keepLines/>
+        <w:pageBreakBefore w:val="0"/>
+        <w:tabs>
+          <w:tab w:pos="720" w:val="left"/>
+          <w:tab w:pos="10858" w:val="right"/>
+        </w:tabs>
+        <w:spacing w:after="30" w:line="230" w:lineRule="exact" w:before="0"/>
+        <w:ind w:left="720" w:hanging="260" w:right="0"/>
+        <w:jc w:val="both"/>
+      </w:pPr>
+      <w:r>
+        <w:rPr>
+          <w:rFonts w:ascii="Palatino" w:hAnsi="Palatino"/>
+          <w:b w:val="0"/>
+          <w:sz w:val="20"/>
+        </w:rPr>
+        <w:t>b)</w:t>
+        <w:tab/>
+      </w:r>
+      <w:r>
+        <w:rPr>
+          <w:rFonts w:eastAsia="Palatino" w:cs="Palatino" w:ascii="Palatino" w:hAnsi="Palatino"/>
+          <w:bCs/>
+          <w:sz w:val="20"/>
+          <w:szCs w:val="20"/>
+          <w:color w:val="292D32"/>
+        </w:rPr>
+        <w:t xml:space="preserve">F.A. Cotton Medal for Excellence in Chemical Research Symposium</w:t>
+      </w:r>
+      <w:r>
+        <w:rPr>
+          <w:rFonts w:eastAsia="Palatino" w:cs="Palatino" w:ascii="Palatino" w:hAnsi="Palatino"/>
+          <w:sz w:val="20"/>
+          <w:szCs w:val="20"/>
+          <w:color w:val="292D32"/>
+        </w:rPr>
+        <w:t xml:space="preserve"> at TAMU</w:t>
+      </w:r>
+      <w:r>
+        <w:rPr>
+          <w:rFonts w:eastAsia="Palatino" w:cs="Palatino" w:ascii="Palatino" w:hAnsi="Palatino"/>
+          <w:color w:val="606A74"/>
+          <w:sz w:val="20"/>
+          <w:szCs w:val="20"/>
+          <w:b w:val="0"/>
+          <w:i w:val="0"/>
+        </w:rPr>
+        <w:tab/>
+      </w:r>
+      <w:r>
+        <w:rPr>
+          <w:rFonts w:eastAsia="Palatino" w:cs="Palatino" w:ascii="Palatino" w:hAnsi="Palatino"/>
+          <w:b w:val="0"/>
+          <w:bCs/>
+          <w:i w:val="0"/>
+          <w:iCs/>
+          <w:color w:val="606A74"/>
+          <w:sz w:val="20"/>
+          <w:szCs w:val="20"/>
+        </w:rPr>
+        <w:t xml:space="preserve">April 2024</w:t>
+      </w:r>
+    </w:p>
+    <w:p>
+      <w:pPr>
         <w:keepNext w:val="0"/>
         <w:keepLines/>
         <w:pageBreakBefore w:val="0"/>
-        <w:numPr>
-          <w:ilvl w:val="1"/>
-          <w:numId w:val="14"/>
-        </w:numPr>
         <w:tabs>
-          <w:tab w:pos="460" w:val="left"/>
+          <w:tab w:pos="720" w:val="left"/>
+          <w:tab w:pos="10858" w:val="right"/>
         </w:tabs>
         <w:spacing w:after="30" w:line="230" w:lineRule="exact" w:before="0"/>
-        <w:ind w:left="360" w:hanging="200"/>
+        <w:ind w:left="720" w:hanging="260" w:right="0"/>
         <w:jc w:val="both"/>
       </w:pPr>
       <w:r>
         <w:rPr>
-          <w:rFonts w:eastAsia="Palatino" w:cs="Palatino" w:ascii="Palatino" w:hAnsi="Palatino"/>
-          <w:bCs/>
-          <w:sz w:val="20"/>
-          <w:szCs w:val="20"/>
-          <w:color w:val="292D32"/>
-        </w:rPr>
-        <w:t xml:space="preserve">F.A. Cotton Medal for Excellence in Chemical Research Symposium</w:t>
-      </w:r>
-      <w:r>
-        <w:rPr>
-          <w:rFonts w:eastAsia="Palatino" w:cs="Palatino" w:ascii="Palatino" w:hAnsi="Palatino"/>
-          <w:sz w:val="20"/>
-          <w:szCs w:val="20"/>
-          <w:color w:val="292D32"/>
-        </w:rPr>
-        <w:t xml:space="preserve"> at TAMU</w:t>
-      </w:r>
-      <w:r>
-        <w:rPr>
-          <w:rFonts w:eastAsia="Palatino" w:cs="Palatino" w:ascii="Palatino" w:hAnsi="Palatino"/>
-          <w:color w:val="606A74"/>
-          <w:sz w:val="20"/>
-          <w:szCs w:val="20"/>
+          <w:rFonts w:ascii="Palatino" w:hAnsi="Palatino"/>
           <w:b w:val="0"/>
-          <w:i w:val="0"/>
-        </w:rPr>
+          <w:sz w:val="20"/>
+        </w:rPr>
+        <w:t>c)</w:t>
         <w:tab/>
       </w:r>
-      <w:r>
-        <w:rPr>
-          <w:rFonts w:eastAsia="Palatino" w:cs="Palatino" w:ascii="Palatino" w:hAnsi="Palatino"/>
-          <w:b w:val="0"/>
-          <w:bCs/>
-          <w:i w:val="0"/>
-          <w:iCs/>
-          <w:color w:val="606A74"/>
-          <w:sz w:val="20"/>
-          <w:szCs w:val="20"/>
-        </w:rPr>
-        <w:t xml:space="preserve">April 2024</w:t>
-      </w:r>
-    </w:p>
-    <w:p>
-      <w:pPr>
-        <w:keepNext w:val="0"/>
-        <w:keepLines/>
-        <w:pageBreakBefore w:val="0"/>
-        <w:numPr>
-          <w:ilvl w:val="1"/>
-          <w:numId w:val="14"/>
-        </w:numPr>
-        <w:tabs>
-          <w:tab w:pos="460" w:val="left"/>
-        </w:tabs>
-        <w:spacing w:after="30" w:line="230" w:lineRule="exact" w:before="0"/>
-        <w:ind w:left="360" w:hanging="200"/>
-        <w:jc w:val="both"/>
-      </w:pPr>
       <w:r>
         <w:rPr>
           <w:rFonts w:eastAsia="Palatino" w:cs="Palatino" w:ascii="Palatino" w:hAnsi="Palatino"/>
@@ -3657,17 +3705,23 @@
         <w:keepNext w:val="0"/>
         <w:keepLines/>
         <w:pageBreakBefore w:val="0"/>
-        <w:numPr>
-          <w:ilvl w:val="0"/>
-          <w:numId w:val="19"/>
-        </w:numPr>
         <w:tabs>
           <w:tab w:pos="460" w:val="left"/>
+          <w:tab w:pos="10858" w:val="right"/>
         </w:tabs>
         <w:spacing w:after="30" w:line="230" w:lineRule="exact" w:before="0"/>
-        <w:ind w:left="460" w:hanging="200"/>
+        <w:ind w:left="460" w:hanging="300" w:right="0"/>
         <w:jc w:val="both"/>
       </w:pPr>
+      <w:r>
+        <w:rPr>
+          <w:rFonts w:ascii="Palatino" w:hAnsi="Palatino"/>
+          <w:b w:val="0"/>
+          <w:sz w:val="20"/>
+        </w:rPr>
+        <w:t>1.</w:t>
+        <w:tab/>
+      </w:r>
       <w:r>
         <w:rPr>
           <w:rFonts w:eastAsia="Palatino" w:cs="Palatino" w:ascii="Palatino" w:hAnsi="Palatino"/>
@@ -3759,17 +3813,23 @@
         <w:keepNext w:val="0"/>
         <w:keepLines/>
         <w:pageBreakBefore w:val="0"/>
-        <w:numPr>
-          <w:ilvl w:val="0"/>
-          <w:numId w:val="19"/>
-        </w:numPr>
         <w:tabs>
           <w:tab w:pos="460" w:val="left"/>
+          <w:tab w:pos="10858" w:val="right"/>
         </w:tabs>
         <w:spacing w:after="30" w:line="230" w:lineRule="exact" w:before="0"/>
-        <w:ind w:left="460" w:hanging="200"/>
+        <w:ind w:left="460" w:hanging="300" w:right="0"/>
         <w:jc w:val="both"/>
       </w:pPr>
+      <w:r>
+        <w:rPr>
+          <w:rFonts w:ascii="Palatino" w:hAnsi="Palatino"/>
+          <w:b w:val="0"/>
+          <w:sz w:val="20"/>
+        </w:rPr>
+        <w:t>2.</w:t>
+        <w:tab/>
+      </w:r>
       <w:r>
         <w:rPr>
           <w:rFonts w:eastAsia="Palatino" w:cs="Palatino" w:ascii="Palatino" w:hAnsi="Palatino"/>

</xml_diff>